<commit_message>
thread creation & join()
</commit_message>
<xml_diff>
--- a/Notes/Multi-Threading.docx
+++ b/Notes/Multi-Threading.docx
@@ -569,7 +569,7 @@
       </w:pPr>
       <w:r>
         <w:pict>
-          <v:rect id="_x0000_i1026" o:spt="1" style="height:1.5pt;width:432pt;" fillcolor="#A0A0A0" filled="t" stroked="f" coordsize="21600,21600" o:hr="t" o:hrstd="t" o:hralign="center">
+          <v:rect id="_x0000_i1025" o:spt="1" style="height:1.5pt;width:432pt;" fillcolor="#A0A0A0" filled="t" stroked="f" coordsize="21600,21600" o:hr="t" o:hrstd="t" o:hralign="center">
             <v:path/>
             <v:fill on="t" focussize="0,0"/>
             <v:stroke on="f"/>
@@ -767,6 +767,7 @@
     </w:p>
     <w:tbl>
       <w:tblPr>
+        <w:tblStyle w:val="4"/>
         <w:tblW w:w="0" w:type="auto"/>
         <w:tblCellSpacing w:w="15" w:type="dxa"/>
         <w:tblInd w:w="0" w:type="dxa"/>
@@ -778,7 +779,7 @@
           <w:insideH w:val="none" w:color="auto" w:sz="0" w:space="0"/>
           <w:insideV w:val="none" w:color="auto" w:sz="0" w:space="0"/>
         </w:tblBorders>
-        <w:shd w:val="clear"/>
+        <w:shd w:val="clear" w:color="auto" w:fill="auto"/>
         <w:tblLayout w:type="autofit"/>
         <w:tblCellMar>
           <w:top w:w="15" w:type="dxa"/>
@@ -801,7 +802,7 @@
             <w:insideH w:val="none" w:color="auto" w:sz="0" w:space="0"/>
             <w:insideV w:val="none" w:color="auto" w:sz="0" w:space="0"/>
           </w:tblBorders>
-          <w:shd w:val="clear"/>
+          <w:shd w:val="clear" w:color="auto" w:fill="auto"/>
           <w:tblCellMar>
             <w:top w:w="15" w:type="dxa"/>
             <w:left w:w="15" w:type="dxa"/>
@@ -816,7 +817,7 @@
         <w:tc>
           <w:tcPr>
             <w:tcW w:w="0" w:type="auto"/>
-            <w:shd w:val="clear"/>
+            <w:shd w:val="clear" w:color="auto" w:fill="auto"/>
             <w:vAlign w:val="center"/>
           </w:tcPr>
           <w:p>
@@ -848,7 +849,7 @@
         <w:tc>
           <w:tcPr>
             <w:tcW w:w="0" w:type="auto"/>
-            <w:shd w:val="clear"/>
+            <w:shd w:val="clear" w:color="auto" w:fill="auto"/>
             <w:vAlign w:val="center"/>
           </w:tcPr>
           <w:p>
@@ -888,7 +889,7 @@
             <w:insideH w:val="none" w:color="auto" w:sz="0" w:space="0"/>
             <w:insideV w:val="none" w:color="auto" w:sz="0" w:space="0"/>
           </w:tblBorders>
-          <w:shd w:val="clear"/>
+          <w:shd w:val="clear" w:color="auto" w:fill="auto"/>
           <w:tblCellMar>
             <w:top w:w="15" w:type="dxa"/>
             <w:left w:w="15" w:type="dxa"/>
@@ -902,7 +903,7 @@
         <w:tc>
           <w:tcPr>
             <w:tcW w:w="0" w:type="auto"/>
-            <w:shd w:val="clear"/>
+            <w:shd w:val="clear" w:color="auto" w:fill="auto"/>
             <w:vAlign w:val="center"/>
           </w:tcPr>
           <w:p>
@@ -928,7 +929,7 @@
         <w:tc>
           <w:tcPr>
             <w:tcW w:w="0" w:type="auto"/>
-            <w:shd w:val="clear"/>
+            <w:shd w:val="clear" w:color="auto" w:fill="auto"/>
             <w:vAlign w:val="center"/>
           </w:tcPr>
           <w:p>
@@ -962,7 +963,6 @@
             <w:insideH w:val="none" w:color="auto" w:sz="0" w:space="0"/>
             <w:insideV w:val="none" w:color="auto" w:sz="0" w:space="0"/>
           </w:tblBorders>
-          <w:shd w:val="clear"/>
           <w:tblCellMar>
             <w:top w:w="15" w:type="dxa"/>
             <w:left w:w="15" w:type="dxa"/>
@@ -976,7 +976,7 @@
         <w:tc>
           <w:tcPr>
             <w:tcW w:w="0" w:type="auto"/>
-            <w:shd w:val="clear"/>
+            <w:shd w:val="clear" w:color="auto" w:fill="auto"/>
             <w:vAlign w:val="center"/>
           </w:tcPr>
           <w:p>
@@ -1002,7 +1002,7 @@
         <w:tc>
           <w:tcPr>
             <w:tcW w:w="0" w:type="auto"/>
-            <w:shd w:val="clear"/>
+            <w:shd w:val="clear" w:color="auto" w:fill="auto"/>
             <w:vAlign w:val="center"/>
           </w:tcPr>
           <w:p>
@@ -1036,7 +1036,6 @@
             <w:insideH w:val="none" w:color="auto" w:sz="0" w:space="0"/>
             <w:insideV w:val="none" w:color="auto" w:sz="0" w:space="0"/>
           </w:tblBorders>
-          <w:shd w:val="clear"/>
           <w:tblCellMar>
             <w:top w:w="15" w:type="dxa"/>
             <w:left w:w="15" w:type="dxa"/>
@@ -1050,7 +1049,7 @@
         <w:tc>
           <w:tcPr>
             <w:tcW w:w="0" w:type="auto"/>
-            <w:shd w:val="clear"/>
+            <w:shd w:val="clear" w:color="auto" w:fill="auto"/>
             <w:vAlign w:val="center"/>
           </w:tcPr>
           <w:p>
@@ -1076,7 +1075,7 @@
         <w:tc>
           <w:tcPr>
             <w:tcW w:w="0" w:type="auto"/>
-            <w:shd w:val="clear"/>
+            <w:shd w:val="clear" w:color="auto" w:fill="auto"/>
             <w:vAlign w:val="center"/>
           </w:tcPr>
           <w:p>
@@ -1110,7 +1109,7 @@
             <w:insideH w:val="none" w:color="auto" w:sz="0" w:space="0"/>
             <w:insideV w:val="none" w:color="auto" w:sz="0" w:space="0"/>
           </w:tblBorders>
-          <w:shd w:val="clear"/>
+          <w:shd w:val="clear" w:color="auto" w:fill="auto"/>
           <w:tblCellMar>
             <w:top w:w="15" w:type="dxa"/>
             <w:left w:w="15" w:type="dxa"/>
@@ -1124,7 +1123,7 @@
         <w:tc>
           <w:tcPr>
             <w:tcW w:w="0" w:type="auto"/>
-            <w:shd w:val="clear"/>
+            <w:shd w:val="clear" w:color="auto" w:fill="auto"/>
             <w:vAlign w:val="center"/>
           </w:tcPr>
           <w:p>
@@ -1150,7 +1149,7 @@
         <w:tc>
           <w:tcPr>
             <w:tcW w:w="0" w:type="auto"/>
-            <w:shd w:val="clear"/>
+            <w:shd w:val="clear" w:color="auto" w:fill="auto"/>
             <w:vAlign w:val="center"/>
           </w:tcPr>
           <w:p>
@@ -3075,6 +3074,7 @@
             <w:insideH w:val="none" w:color="auto" w:sz="0" w:space="0"/>
             <w:insideV w:val="none" w:color="auto" w:sz="0" w:space="0"/>
           </w:tblBorders>
+          <w:shd w:val="clear" w:color="auto" w:fill="auto"/>
           <w:tblCellMar>
             <w:top w:w="15" w:type="dxa"/>
             <w:left w:w="15" w:type="dxa"/>
@@ -3944,7 +3944,7 @@
       </w:pPr>
       <w:r>
         <w:pict>
-          <v:rect id="_x0000_i1025" o:spt="1" style="height:1.5pt;width:432pt;" fillcolor="#A0A0A0" filled="t" stroked="f" coordsize="21600,21600" o:hr="t" o:hrstd="t" o:hralign="center">
+          <v:rect id="_x0000_i1026" o:spt="1" style="height:1.5pt;width:432pt;" fillcolor="#A0A0A0" filled="t" stroked="f" coordsize="21600,21600" o:hr="t" o:hrstd="t" o:hralign="center">
             <v:path/>
             <v:fill on="t" focussize="0,0"/>
             <v:stroke on="f"/>
@@ -7371,6 +7371,862 @@
           <w:rFonts w:hint="default"/>
         </w:rPr>
       </w:pPr>
+    </w:p>
+    <w:p>
+      <w:pPr>
+        <w:pStyle w:val="7"/>
+        <w:keepNext w:val="0"/>
+        <w:keepLines w:val="0"/>
+        <w:widowControl/>
+        <w:suppressLineNumbers w:val="0"/>
+        <w:rPr>
+          <w:rFonts w:hint="default"/>
+        </w:rPr>
+      </w:pPr>
+      <w:r>
+        <w:rPr>
+          <w:rFonts w:hint="default"/>
+        </w:rPr>
+        <w:t>Note:</w:t>
+      </w:r>
+    </w:p>
+    <w:p>
+      <w:pPr>
+        <w:pStyle w:val="7"/>
+        <w:keepNext w:val="0"/>
+        <w:keepLines w:val="0"/>
+        <w:widowControl/>
+        <w:suppressLineNumbers w:val="0"/>
+        <w:rPr>
+          <w:rFonts w:hint="default"/>
+        </w:rPr>
+      </w:pPr>
+      <w:r>
+        <w:rPr>
+          <w:rFonts w:hint="default"/>
+        </w:rPr>
+        <w:t>RUNNING is NOT a separate state in Java's Thread.State.</w:t>
+      </w:r>
+    </w:p>
+    <w:p>
+      <w:pPr>
+        <w:pStyle w:val="7"/>
+        <w:keepNext w:val="0"/>
+        <w:keepLines w:val="0"/>
+        <w:widowControl/>
+        <w:suppressLineNumbers w:val="0"/>
+        <w:rPr>
+          <w:rFonts w:hint="default"/>
+        </w:rPr>
+      </w:pPr>
+      <w:r>
+        <w:rPr>
+          <w:rFonts w:hint="default"/>
+        </w:rPr>
+        <w:t>A running thread is considered part of the RUNNABLE state.</w:t>
+      </w:r>
+    </w:p>
+    <w:p>
+      <w:pPr>
+        <w:rPr>
+          <w:rFonts w:hint="default"/>
+        </w:rPr>
+      </w:pPr>
+      <w:r>
+        <w:rPr>
+          <w:rFonts w:hint="default"/>
+        </w:rPr>
+        <w:br w:type="page"/>
+      </w:r>
+    </w:p>
+    <w:p>
+      <w:pPr>
+        <w:pStyle w:val="7"/>
+        <w:keepNext w:val="0"/>
+        <w:keepLines w:val="0"/>
+        <w:widowControl/>
+        <w:suppressLineNumbers w:val="0"/>
+        <w:rPr>
+          <w:rFonts w:hint="default"/>
+        </w:rPr>
+      </w:pPr>
+      <w:r>
+        <w:rPr>
+          <w:rFonts w:hint="default"/>
+        </w:rPr>
+        <w:br w:type="textWrapping"/>
+      </w:r>
+      <w:r>
+        <w:rPr>
+          <w:rFonts w:hint="default"/>
+          <w:color w:val="0000FF"/>
+          <w:sz w:val="36"/>
+          <w:szCs w:val="36"/>
+        </w:rPr>
+        <w:t>JOIN()</w:t>
+      </w:r>
+    </w:p>
+    <w:p>
+      <w:pPr>
+        <w:pStyle w:val="7"/>
+        <w:keepNext w:val="0"/>
+        <w:keepLines w:val="0"/>
+        <w:widowControl/>
+        <w:suppressLineNumbers w:val="0"/>
+        <w:rPr>
+          <w:rFonts w:hint="default"/>
+          <w:u w:val="single"/>
+        </w:rPr>
+      </w:pPr>
+      <w:r>
+        <w:rPr>
+          <w:rFonts w:hint="default"/>
+          <w:u w:val="single"/>
+        </w:rPr>
+        <w:t>Definition:</w:t>
+      </w:r>
+    </w:p>
+    <w:p>
+      <w:pPr>
+        <w:pStyle w:val="7"/>
+        <w:keepNext w:val="0"/>
+        <w:keepLines w:val="0"/>
+        <w:widowControl/>
+        <w:suppressLineNumbers w:val="0"/>
+        <w:rPr>
+          <w:rFonts w:hint="default"/>
+        </w:rPr>
+      </w:pPr>
+      <w:r>
+        <w:rPr>
+          <w:rFonts w:hint="default"/>
+        </w:rPr>
+        <w:t>join() is used when one thread needs to WAIT for another thread to finish its execution.</w:t>
+      </w:r>
+    </w:p>
+    <w:p>
+      <w:pPr>
+        <w:pStyle w:val="7"/>
+        <w:keepNext w:val="0"/>
+        <w:keepLines w:val="0"/>
+        <w:widowControl/>
+        <w:suppressLineNumbers w:val="0"/>
+        <w:rPr>
+          <w:rFonts w:hint="default"/>
+        </w:rPr>
+      </w:pPr>
+    </w:p>
+    <w:p>
+      <w:pPr>
+        <w:pStyle w:val="7"/>
+        <w:keepNext w:val="0"/>
+        <w:keepLines w:val="0"/>
+        <w:widowControl/>
+        <w:suppressLineNumbers w:val="0"/>
+        <w:rPr>
+          <w:rFonts w:hint="default"/>
+          <w:u w:val="single"/>
+        </w:rPr>
+      </w:pPr>
+      <w:r>
+        <w:rPr>
+          <w:rFonts w:hint="default"/>
+          <w:u w:val="single"/>
+        </w:rPr>
+        <w:t>Syntax:</w:t>
+      </w:r>
+    </w:p>
+    <w:p>
+      <w:pPr>
+        <w:pStyle w:val="7"/>
+        <w:keepNext w:val="0"/>
+        <w:keepLines w:val="0"/>
+        <w:widowControl/>
+        <w:suppressLineNumbers w:val="0"/>
+        <w:rPr>
+          <w:rFonts w:hint="default"/>
+        </w:rPr>
+      </w:pPr>
+      <w:r>
+        <w:rPr>
+          <w:rFonts w:hint="default"/>
+        </w:rPr>
+        <w:t>thread.join();</w:t>
+      </w:r>
+    </w:p>
+    <w:p>
+      <w:pPr>
+        <w:pStyle w:val="7"/>
+        <w:keepNext w:val="0"/>
+        <w:keepLines w:val="0"/>
+        <w:widowControl/>
+        <w:suppressLineNumbers w:val="0"/>
+        <w:rPr>
+          <w:rFonts w:hint="default"/>
+        </w:rPr>
+      </w:pPr>
+    </w:p>
+    <w:p>
+      <w:pPr>
+        <w:pStyle w:val="7"/>
+        <w:keepNext w:val="0"/>
+        <w:keepLines w:val="0"/>
+        <w:widowControl/>
+        <w:suppressLineNumbers w:val="0"/>
+        <w:rPr>
+          <w:rFonts w:hint="default"/>
+          <w:u w:val="single"/>
+        </w:rPr>
+      </w:pPr>
+      <w:r>
+        <w:rPr>
+          <w:rFonts w:hint="default"/>
+          <w:u w:val="single"/>
+        </w:rPr>
+        <w:t>Example:</w:t>
+      </w:r>
+    </w:p>
+    <w:p>
+      <w:pPr>
+        <w:pStyle w:val="7"/>
+        <w:keepNext w:val="0"/>
+        <w:keepLines w:val="0"/>
+        <w:widowControl/>
+        <w:suppressLineNumbers w:val="0"/>
+        <w:rPr>
+          <w:rFonts w:hint="default"/>
+        </w:rPr>
+      </w:pPr>
+      <w:r>
+        <w:rPr>
+          <w:rFonts w:hint="default"/>
+        </w:rPr>
+        <w:t>Thread t1 = new Thread(() -&gt; {</w:t>
+      </w:r>
+    </w:p>
+    <w:p>
+      <w:pPr>
+        <w:pStyle w:val="7"/>
+        <w:keepNext w:val="0"/>
+        <w:keepLines w:val="0"/>
+        <w:widowControl/>
+        <w:suppressLineNumbers w:val="0"/>
+        <w:rPr>
+          <w:rFonts w:hint="default"/>
+        </w:rPr>
+      </w:pPr>
+      <w:r>
+        <w:rPr>
+          <w:rFonts w:hint="default"/>
+        </w:rPr>
+        <w:t xml:space="preserve">    // some task</w:t>
+      </w:r>
+    </w:p>
+    <w:p>
+      <w:pPr>
+        <w:pStyle w:val="7"/>
+        <w:keepNext w:val="0"/>
+        <w:keepLines w:val="0"/>
+        <w:widowControl/>
+        <w:suppressLineNumbers w:val="0"/>
+        <w:rPr>
+          <w:rFonts w:hint="default"/>
+        </w:rPr>
+      </w:pPr>
+      <w:r>
+        <w:rPr>
+          <w:rFonts w:hint="default"/>
+        </w:rPr>
+        <w:t>});</w:t>
+      </w:r>
+    </w:p>
+    <w:p>
+      <w:pPr>
+        <w:pStyle w:val="7"/>
+        <w:keepNext w:val="0"/>
+        <w:keepLines w:val="0"/>
+        <w:widowControl/>
+        <w:suppressLineNumbers w:val="0"/>
+        <w:rPr>
+          <w:rFonts w:hint="default"/>
+        </w:rPr>
+      </w:pPr>
+      <w:r>
+        <w:rPr>
+          <w:rFonts w:hint="default"/>
+        </w:rPr>
+        <w:t>t1.start();</w:t>
+      </w:r>
+    </w:p>
+    <w:p>
+      <w:pPr>
+        <w:pStyle w:val="7"/>
+        <w:keepNext w:val="0"/>
+        <w:keepLines w:val="0"/>
+        <w:widowControl/>
+        <w:suppressLineNumbers w:val="0"/>
+        <w:rPr>
+          <w:rFonts w:hint="default"/>
+        </w:rPr>
+      </w:pPr>
+      <w:r>
+        <w:rPr>
+          <w:rFonts w:hint="default"/>
+        </w:rPr>
+        <w:t>t1.join();</w:t>
+      </w:r>
+    </w:p>
+    <w:p>
+      <w:pPr>
+        <w:pStyle w:val="7"/>
+        <w:keepNext w:val="0"/>
+        <w:keepLines w:val="0"/>
+        <w:widowControl/>
+        <w:suppressLineNumbers w:val="0"/>
+        <w:rPr>
+          <w:rFonts w:hint="default"/>
+        </w:rPr>
+      </w:pPr>
+      <w:r>
+        <w:rPr>
+          <w:rFonts w:hint="default"/>
+        </w:rPr>
+        <w:t>// This code executes only after t1 finishes.</w:t>
+      </w:r>
+    </w:p>
+    <w:p>
+      <w:pPr>
+        <w:pStyle w:val="7"/>
+        <w:keepNext w:val="0"/>
+        <w:keepLines w:val="0"/>
+        <w:widowControl/>
+        <w:suppressLineNumbers w:val="0"/>
+        <w:rPr>
+          <w:rFonts w:hint="default"/>
+          <w:u w:val="single"/>
+        </w:rPr>
+      </w:pPr>
+    </w:p>
+    <w:p>
+      <w:pPr>
+        <w:pStyle w:val="7"/>
+        <w:keepNext w:val="0"/>
+        <w:keepLines w:val="0"/>
+        <w:widowControl/>
+        <w:suppressLineNumbers w:val="0"/>
+        <w:rPr>
+          <w:rFonts w:hint="default"/>
+          <w:u w:val="single"/>
+        </w:rPr>
+      </w:pPr>
+      <w:r>
+        <w:rPr>
+          <w:rFonts w:hint="default"/>
+          <w:u w:val="single"/>
+        </w:rPr>
+        <w:t>WHY DO WE USE join()?</w:t>
+      </w:r>
+    </w:p>
+    <w:p>
+      <w:pPr>
+        <w:pStyle w:val="7"/>
+        <w:keepNext w:val="0"/>
+        <w:keepLines w:val="0"/>
+        <w:widowControl/>
+        <w:suppressLineNumbers w:val="0"/>
+        <w:rPr>
+          <w:rFonts w:hint="default"/>
+          <w:u w:val="single"/>
+        </w:rPr>
+      </w:pPr>
+      <w:r>
+        <w:rPr>
+          <w:rFonts w:hint="default"/>
+          <w:u w:val="single"/>
+        </w:rPr>
+        <w:t>Without join():</w:t>
+      </w:r>
+    </w:p>
+    <w:p>
+      <w:pPr>
+        <w:pStyle w:val="7"/>
+        <w:keepNext w:val="0"/>
+        <w:keepLines w:val="0"/>
+        <w:widowControl/>
+        <w:suppressLineNumbers w:val="0"/>
+        <w:rPr>
+          <w:rFonts w:hint="default"/>
+        </w:rPr>
+      </w:pPr>
+      <w:r>
+        <w:rPr>
+          <w:rFonts w:hint="default"/>
+        </w:rPr>
+        <w:t xml:space="preserve">    Main Thread → starts t1</w:t>
+      </w:r>
+    </w:p>
+    <w:p>
+      <w:pPr>
+        <w:pStyle w:val="7"/>
+        <w:keepNext w:val="0"/>
+        <w:keepLines w:val="0"/>
+        <w:widowControl/>
+        <w:suppressLineNumbers w:val="0"/>
+        <w:rPr>
+          <w:rFonts w:hint="default"/>
+        </w:rPr>
+      </w:pPr>
+      <w:r>
+        <w:rPr>
+          <w:rFonts w:hint="default"/>
+        </w:rPr>
+        <w:t xml:space="preserve">    Main Thread → continues immediately</w:t>
+      </w:r>
+    </w:p>
+    <w:p>
+      <w:pPr>
+        <w:pStyle w:val="7"/>
+        <w:keepNext w:val="0"/>
+        <w:keepLines w:val="0"/>
+        <w:widowControl/>
+        <w:suppressLineNumbers w:val="0"/>
+        <w:rPr>
+          <w:rFonts w:hint="default"/>
+        </w:rPr>
+      </w:pPr>
+      <w:r>
+        <w:rPr>
+          <w:rFonts w:hint="default"/>
+        </w:rPr>
+        <w:t xml:space="preserve">    t1 → runs independently</w:t>
+      </w:r>
+    </w:p>
+    <w:p>
+      <w:pPr>
+        <w:pStyle w:val="7"/>
+        <w:keepNext w:val="0"/>
+        <w:keepLines w:val="0"/>
+        <w:widowControl/>
+        <w:suppressLineNumbers w:val="0"/>
+        <w:rPr>
+          <w:rFonts w:hint="default"/>
+          <w:u w:val="single"/>
+        </w:rPr>
+      </w:pPr>
+    </w:p>
+    <w:p>
+      <w:pPr>
+        <w:pStyle w:val="7"/>
+        <w:keepNext w:val="0"/>
+        <w:keepLines w:val="0"/>
+        <w:widowControl/>
+        <w:suppressLineNumbers w:val="0"/>
+        <w:rPr>
+          <w:rFonts w:hint="default"/>
+          <w:u w:val="single"/>
+        </w:rPr>
+      </w:pPr>
+      <w:r>
+        <w:rPr>
+          <w:rFonts w:hint="default"/>
+          <w:u w:val="single"/>
+        </w:rPr>
+        <w:t>With join():</w:t>
+      </w:r>
+    </w:p>
+    <w:p>
+      <w:pPr>
+        <w:pStyle w:val="7"/>
+        <w:keepNext w:val="0"/>
+        <w:keepLines w:val="0"/>
+        <w:widowControl/>
+        <w:suppressLineNumbers w:val="0"/>
+        <w:rPr>
+          <w:rFonts w:hint="default"/>
+        </w:rPr>
+      </w:pPr>
+      <w:r>
+        <w:rPr>
+          <w:rFonts w:hint="default"/>
+        </w:rPr>
+        <w:t xml:space="preserve">    Main Thread → starts t1</w:t>
+      </w:r>
+    </w:p>
+    <w:p>
+      <w:pPr>
+        <w:pStyle w:val="7"/>
+        <w:keepNext w:val="0"/>
+        <w:keepLines w:val="0"/>
+        <w:widowControl/>
+        <w:suppressLineNumbers w:val="0"/>
+        <w:rPr>
+          <w:rFonts w:hint="default"/>
+        </w:rPr>
+      </w:pPr>
+      <w:r>
+        <w:rPr>
+          <w:rFonts w:hint="default"/>
+        </w:rPr>
+        <w:t xml:space="preserve">    Main Thread → WAITS</w:t>
+      </w:r>
+    </w:p>
+    <w:p>
+      <w:pPr>
+        <w:pStyle w:val="7"/>
+        <w:keepNext w:val="0"/>
+        <w:keepLines w:val="0"/>
+        <w:widowControl/>
+        <w:suppressLineNumbers w:val="0"/>
+        <w:rPr>
+          <w:rFonts w:hint="default"/>
+        </w:rPr>
+      </w:pPr>
+      <w:r>
+        <w:rPr>
+          <w:rFonts w:hint="default"/>
+        </w:rPr>
+        <w:t xml:space="preserve">    t1 → finishes</w:t>
+      </w:r>
+    </w:p>
+    <w:p>
+      <w:pPr>
+        <w:pStyle w:val="7"/>
+        <w:keepNext w:val="0"/>
+        <w:keepLines w:val="0"/>
+        <w:widowControl/>
+        <w:suppressLineNumbers w:val="0"/>
+        <w:rPr>
+          <w:rFonts w:hint="default"/>
+        </w:rPr>
+      </w:pPr>
+      <w:r>
+        <w:rPr>
+          <w:rFonts w:hint="default"/>
+        </w:rPr>
+        <w:t xml:space="preserve">    Main Thread → continues</w:t>
+      </w:r>
+    </w:p>
+    <w:p>
+      <w:pPr>
+        <w:pStyle w:val="7"/>
+        <w:keepNext w:val="0"/>
+        <w:keepLines w:val="0"/>
+        <w:widowControl/>
+        <w:suppressLineNumbers w:val="0"/>
+        <w:rPr>
+          <w:rFonts w:hint="default"/>
+        </w:rPr>
+      </w:pPr>
+    </w:p>
+    <w:p>
+      <w:pPr>
+        <w:pStyle w:val="7"/>
+        <w:keepNext w:val="0"/>
+        <w:keepLines w:val="0"/>
+        <w:widowControl/>
+        <w:suppressLineNumbers w:val="0"/>
+        <w:rPr>
+          <w:rFonts w:hint="default"/>
+        </w:rPr>
+      </w:pPr>
+    </w:p>
+    <w:p>
+      <w:pPr>
+        <w:pStyle w:val="7"/>
+        <w:keepNext w:val="0"/>
+        <w:keepLines w:val="0"/>
+        <w:widowControl/>
+        <w:suppressLineNumbers w:val="0"/>
+        <w:rPr>
+          <w:rFonts w:hint="default"/>
+          <w:u w:val="single"/>
+        </w:rPr>
+      </w:pPr>
+      <w:r>
+        <w:rPr>
+          <w:rFonts w:hint="default"/>
+          <w:u w:val="single"/>
+        </w:rPr>
+        <w:t>IMPORTANT:</w:t>
+      </w:r>
+    </w:p>
+    <w:p>
+      <w:pPr>
+        <w:pStyle w:val="7"/>
+        <w:keepNext w:val="0"/>
+        <w:keepLines w:val="0"/>
+        <w:widowControl/>
+        <w:suppressLineNumbers w:val="0"/>
+        <w:rPr>
+          <w:rFonts w:hint="default"/>
+        </w:rPr>
+      </w:pPr>
+      <w:r>
+        <w:rPr>
+          <w:rFonts w:hint="default"/>
+        </w:rPr>
+        <w:t>join() makes the CURRENT thread wait.</w:t>
+      </w:r>
+    </w:p>
+    <w:p>
+      <w:pPr>
+        <w:pStyle w:val="7"/>
+        <w:keepNext w:val="0"/>
+        <w:keepLines w:val="0"/>
+        <w:widowControl/>
+        <w:suppressLineNumbers w:val="0"/>
+        <w:rPr>
+          <w:rFonts w:hint="default"/>
+        </w:rPr>
+      </w:pPr>
+      <w:r>
+        <w:rPr>
+          <w:rFonts w:hint="default"/>
+        </w:rPr>
+        <w:t>If main() calls:</w:t>
+      </w:r>
+    </w:p>
+    <w:p>
+      <w:pPr>
+        <w:pStyle w:val="7"/>
+        <w:keepNext w:val="0"/>
+        <w:keepLines w:val="0"/>
+        <w:widowControl/>
+        <w:suppressLineNumbers w:val="0"/>
+        <w:rPr>
+          <w:rFonts w:hint="default"/>
+        </w:rPr>
+      </w:pPr>
+      <w:r>
+        <w:rPr>
+          <w:rFonts w:hint="default"/>
+        </w:rPr>
+        <w:t>t1.join();</w:t>
+      </w:r>
+    </w:p>
+    <w:p>
+      <w:pPr>
+        <w:pStyle w:val="7"/>
+        <w:keepNext w:val="0"/>
+        <w:keepLines w:val="0"/>
+        <w:widowControl/>
+        <w:suppressLineNumbers w:val="0"/>
+        <w:rPr>
+          <w:rFonts w:hint="default"/>
+        </w:rPr>
+      </w:pPr>
+      <w:r>
+        <w:rPr>
+          <w:rFonts w:hint="default"/>
+        </w:rPr>
+        <w:t>then the main thread waits for t1 to finish.</w:t>
+      </w:r>
+    </w:p>
+    <w:p>
+      <w:pPr>
+        <w:pStyle w:val="7"/>
+        <w:keepNext w:val="0"/>
+        <w:keepLines w:val="0"/>
+        <w:widowControl/>
+        <w:suppressLineNumbers w:val="0"/>
+        <w:rPr>
+          <w:rFonts w:hint="default"/>
+        </w:rPr>
+      </w:pPr>
+    </w:p>
+    <w:p>
+      <w:pPr>
+        <w:pStyle w:val="7"/>
+        <w:keepNext w:val="0"/>
+        <w:keepLines w:val="0"/>
+        <w:widowControl/>
+        <w:suppressLineNumbers w:val="0"/>
+        <w:rPr>
+          <w:rFonts w:hint="default"/>
+        </w:rPr>
+      </w:pPr>
+      <w:r>
+        <w:rPr>
+          <w:rFonts w:hint="default"/>
+        </w:rPr>
+        <w:t>WHERE IS IT USED IN DEVELOPMENT?</w:t>
+      </w:r>
+    </w:p>
+    <w:p>
+      <w:pPr>
+        <w:pStyle w:val="7"/>
+        <w:keepNext w:val="0"/>
+        <w:keepLines w:val="0"/>
+        <w:widowControl/>
+        <w:suppressLineNumbers w:val="0"/>
+        <w:rPr>
+          <w:rFonts w:hint="default"/>
+        </w:rPr>
+      </w:pPr>
+      <w:r>
+        <w:rPr>
+          <w:rFonts w:hint="default"/>
+        </w:rPr>
+        <w:t>Used when one task depends on another thread completing first.</w:t>
+      </w:r>
+    </w:p>
+    <w:p>
+      <w:pPr>
+        <w:pStyle w:val="7"/>
+        <w:keepNext w:val="0"/>
+        <w:keepLines w:val="0"/>
+        <w:widowControl/>
+        <w:suppressLineNumbers w:val="0"/>
+        <w:rPr>
+          <w:rFonts w:hint="default"/>
+        </w:rPr>
+      </w:pPr>
+    </w:p>
+    <w:p>
+      <w:pPr>
+        <w:pStyle w:val="7"/>
+        <w:keepNext w:val="0"/>
+        <w:keepLines w:val="0"/>
+        <w:widowControl/>
+        <w:suppressLineNumbers w:val="0"/>
+        <w:rPr>
+          <w:rFonts w:hint="default"/>
+        </w:rPr>
+      </w:pPr>
+      <w:r>
+        <w:rPr>
+          <w:rFonts w:hint="default"/>
+        </w:rPr>
+        <w:t>Example:</w:t>
+      </w:r>
+    </w:p>
+    <w:p>
+      <w:pPr>
+        <w:pStyle w:val="7"/>
+        <w:keepNext w:val="0"/>
+        <w:keepLines w:val="0"/>
+        <w:widowControl/>
+        <w:suppressLineNumbers w:val="0"/>
+        <w:rPr>
+          <w:rFonts w:hint="default"/>
+        </w:rPr>
+      </w:pPr>
+      <w:r>
+        <w:rPr>
+          <w:rFonts w:hint="default"/>
+        </w:rPr>
+        <w:t>- Start a background calculation</w:t>
+      </w:r>
+    </w:p>
+    <w:p>
+      <w:pPr>
+        <w:pStyle w:val="7"/>
+        <w:keepNext w:val="0"/>
+        <w:keepLines w:val="0"/>
+        <w:widowControl/>
+        <w:suppressLineNumbers w:val="0"/>
+        <w:rPr>
+          <w:rFonts w:hint="default"/>
+        </w:rPr>
+      </w:pPr>
+      <w:r>
+        <w:rPr>
+          <w:rFonts w:hint="default"/>
+        </w:rPr>
+        <w:t>- Wait for it to finish</w:t>
+      </w:r>
+    </w:p>
+    <w:p>
+      <w:pPr>
+        <w:pStyle w:val="7"/>
+        <w:keepNext w:val="0"/>
+        <w:keepLines w:val="0"/>
+        <w:widowControl/>
+        <w:suppressLineNumbers w:val="0"/>
+        <w:rPr>
+          <w:rFonts w:hint="default"/>
+        </w:rPr>
+      </w:pPr>
+      <w:r>
+        <w:rPr>
+          <w:rFonts w:hint="default"/>
+        </w:rPr>
+        <w:t>- Use its result in the next step</w:t>
+      </w:r>
+    </w:p>
+    <w:p>
+      <w:pPr>
+        <w:pStyle w:val="7"/>
+        <w:keepNext w:val="0"/>
+        <w:keepLines w:val="0"/>
+        <w:widowControl/>
+        <w:suppressLineNumbers w:val="0"/>
+        <w:rPr>
+          <w:rFonts w:hint="default"/>
+        </w:rPr>
+      </w:pPr>
+    </w:p>
+    <w:p>
+      <w:pPr>
+        <w:pStyle w:val="7"/>
+        <w:keepNext w:val="0"/>
+        <w:keepLines w:val="0"/>
+        <w:widowControl/>
+        <w:suppressLineNumbers w:val="0"/>
+        <w:rPr>
+          <w:rFonts w:hint="default"/>
+        </w:rPr>
+      </w:pPr>
+      <w:r>
+        <w:rPr>
+          <w:rFonts w:hint="default"/>
+        </w:rPr>
+        <w:t>It is useful when you need a specific execution order between threads.</w:t>
+      </w:r>
+    </w:p>
+    <w:p>
+      <w:pPr>
+        <w:pStyle w:val="7"/>
+        <w:keepNext w:val="0"/>
+        <w:keepLines w:val="0"/>
+        <w:widowControl/>
+        <w:suppressLineNumbers w:val="0"/>
+        <w:rPr>
+          <w:rFonts w:hint="default"/>
+          <w:u w:val="single"/>
+        </w:rPr>
+      </w:pPr>
+      <w:r>
+        <w:rPr>
+          <w:rFonts w:hint="default"/>
+          <w:u w:val="single"/>
+        </w:rPr>
+        <w:t>In modern production code, ExecutorService, Future, and CompletableFuture are often preferred for coordinating tasks, but join() is still important for basic thread coordination and interviews.</w:t>
+      </w:r>
+    </w:p>
+    <w:p>
+      <w:pPr>
+        <w:pStyle w:val="7"/>
+        <w:keepNext w:val="0"/>
+        <w:keepLines w:val="0"/>
+        <w:widowControl/>
+        <w:suppressLineNumbers w:val="0"/>
+        <w:rPr>
+          <w:rFonts w:hint="default"/>
+        </w:rPr>
+      </w:pPr>
+    </w:p>
+    <w:p>
+      <w:pPr>
+        <w:pStyle w:val="7"/>
+        <w:keepNext w:val="0"/>
+        <w:keepLines w:val="0"/>
+        <w:widowControl/>
+        <w:suppressLineNumbers w:val="0"/>
+        <w:rPr>
+          <w:rFonts w:hint="default"/>
+        </w:rPr>
+      </w:pPr>
       <w:bookmarkStart w:id="0" w:name="_GoBack"/>
       <w:bookmarkEnd w:id="0"/>
     </w:p>
@@ -7383,46 +8239,33 @@
         <w:suppressLineNumbers w:val="0"/>
         <w:rPr>
           <w:rFonts w:hint="default"/>
-        </w:rPr>
-      </w:pPr>
-      <w:r>
-        <w:rPr>
-          <w:rFonts w:hint="default"/>
-        </w:rPr>
-        <w:t>Note:</w:t>
-      </w:r>
-    </w:p>
-    <w:p>
-      <w:pPr>
-        <w:pStyle w:val="7"/>
-        <w:keepNext w:val="0"/>
-        <w:keepLines w:val="0"/>
-        <w:widowControl/>
-        <w:suppressLineNumbers w:val="0"/>
-        <w:rPr>
-          <w:rFonts w:hint="default"/>
-        </w:rPr>
-      </w:pPr>
-      <w:r>
-        <w:rPr>
-          <w:rFonts w:hint="default"/>
-        </w:rPr>
-        <w:t>RUNNING is NOT a separate state in Java's Thread.State.</w:t>
-      </w:r>
-    </w:p>
-    <w:p>
-      <w:pPr>
-        <w:pStyle w:val="7"/>
-        <w:keepNext w:val="0"/>
-        <w:keepLines w:val="0"/>
-        <w:widowControl/>
-        <w:suppressLineNumbers w:val="0"/>
-      </w:pPr>
-      <w:r>
-        <w:rPr>
-          <w:rFonts w:hint="default"/>
-        </w:rPr>
-        <w:t>A running thread is considered part of the RUNNABLE state.</w:t>
+          <w:u w:val="single"/>
+        </w:rPr>
+      </w:pPr>
+      <w:r>
+        <w:rPr>
+          <w:rFonts w:hint="default"/>
+          <w:u w:val="single"/>
+        </w:rPr>
+        <w:t>INTERVIEW POINT:</w:t>
+      </w:r>
+    </w:p>
+    <w:p>
+      <w:pPr>
+        <w:pStyle w:val="7"/>
+        <w:keepNext w:val="0"/>
+        <w:keepLines w:val="0"/>
+        <w:widowControl/>
+        <w:suppressLineNumbers w:val="0"/>
+        <w:rPr>
+          <w:rFonts w:hint="default"/>
+        </w:rPr>
+      </w:pPr>
+      <w:r>
+        <w:rPr>
+          <w:rFonts w:hint="default"/>
+        </w:rPr>
+        <w:t>join() causes the calling thread to wait until the specified thread terminates.</w:t>
       </w:r>
     </w:p>
     <w:p>
@@ -7436,7 +8279,6 @@
     <w:sectPr>
       <w:pgSz w:w="11906" w:h="16838"/>
       <w:pgMar w:top="720" w:right="720" w:bottom="720" w:left="720" w:header="720" w:footer="720" w:gutter="0"/>
-      <w:paperSrc/>
       <w:cols w:space="0" w:num="1"/>
       <w:rtlGutter w:val="0"/>
       <w:docGrid w:linePitch="360" w:charSpace="0"/>

</xml_diff>